<commit_message>
Increase font sizes: Table line 120pt, name line 60-72pt
https://claude.ai/code/session_018jBfKurk3FoLxx949PscUM
</commit_message>
<xml_diff>
--- a/Table_Assignments.docx
+++ b/Table_Assignments.docx
@@ -5,31 +5,31 @@
     <w:p>
       <w:pPr>
         <w:spacing w:before="0" w:after="0"/>
-        <w:spacing w:before="1400" w:after="0"/>
+        <w:spacing w:before="400" w:after="0"/>
       </w:pPr>
     </w:p>
     <w:p>
       <w:pPr>
-        <w:spacing w:before="0" w:after="160"/>
+        <w:spacing w:before="0" w:after="240"/>
         <w:jc w:val="center"/>
       </w:pPr>
       <w:r>
         <w:rPr>
           <w:b/>
-          <w:sz w:val="96"/>
+          <w:sz w:val="240"/>
         </w:rPr>
         <w:t>Table 1</w:t>
       </w:r>
     </w:p>
     <w:p>
       <w:pPr>
-        <w:spacing w:before="0" w:after="80"/>
+        <w:spacing w:before="0" w:after="120"/>
         <w:jc w:val="center"/>
       </w:pPr>
       <w:r>
         <w:rPr>
           <w:b/>
-          <w:sz w:val="56"/>
+          <w:sz w:val="144"/>
         </w:rPr>
         <w:t>Newdale Ward</w:t>
       </w:r>
@@ -46,31 +46,31 @@
     <w:p>
       <w:pPr>
         <w:spacing w:before="0" w:after="0"/>
-        <w:spacing w:before="1400" w:after="0"/>
+        <w:spacing w:before="400" w:after="0"/>
       </w:pPr>
     </w:p>
     <w:p>
       <w:pPr>
-        <w:spacing w:before="0" w:after="160"/>
+        <w:spacing w:before="0" w:after="240"/>
         <w:jc w:val="center"/>
       </w:pPr>
       <w:r>
         <w:rPr>
           <w:b/>
-          <w:sz w:val="96"/>
+          <w:sz w:val="240"/>
         </w:rPr>
         <w:t>Table 2</w:t>
       </w:r>
     </w:p>
     <w:p>
       <w:pPr>
-        <w:spacing w:before="0" w:after="80"/>
+        <w:spacing w:before="0" w:after="120"/>
         <w:jc w:val="center"/>
       </w:pPr>
       <w:r>
         <w:rPr>
           <w:b/>
-          <w:sz w:val="56"/>
+          <w:sz w:val="144"/>
         </w:rPr>
         <w:t>Newdale Ward</w:t>
       </w:r>
@@ -86,31 +86,31 @@
     <w:p>
       <w:pPr>
         <w:spacing w:before="0" w:after="0"/>
-        <w:spacing w:before="1400" w:after="0"/>
+        <w:spacing w:before="400" w:after="0"/>
       </w:pPr>
     </w:p>
     <w:p>
       <w:pPr>
-        <w:spacing w:before="0" w:after="160"/>
+        <w:spacing w:before="0" w:after="240"/>
         <w:jc w:val="center"/>
       </w:pPr>
       <w:r>
         <w:rPr>
           <w:b/>
-          <w:sz w:val="96"/>
+          <w:sz w:val="240"/>
         </w:rPr>
         <w:t>Table 3</w:t>
       </w:r>
     </w:p>
     <w:p>
       <w:pPr>
-        <w:spacing w:before="0" w:after="80"/>
+        <w:spacing w:before="0" w:after="120"/>
         <w:jc w:val="center"/>
       </w:pPr>
       <w:r>
         <w:rPr>
           <w:b/>
-          <w:sz w:val="56"/>
+          <w:sz w:val="144"/>
         </w:rPr>
         <w:t>Aspen Ward</w:t>
       </w:r>
@@ -127,31 +127,31 @@
     <w:p>
       <w:pPr>
         <w:spacing w:before="0" w:after="0"/>
-        <w:spacing w:before="1400" w:after="0"/>
+        <w:spacing w:before="400" w:after="0"/>
       </w:pPr>
     </w:p>
     <w:p>
       <w:pPr>
-        <w:spacing w:before="0" w:after="160"/>
+        <w:spacing w:before="0" w:after="240"/>
         <w:jc w:val="center"/>
       </w:pPr>
       <w:r>
         <w:rPr>
           <w:b/>
-          <w:sz w:val="96"/>
+          <w:sz w:val="240"/>
         </w:rPr>
         <w:t>Table 4</w:t>
       </w:r>
     </w:p>
     <w:p>
       <w:pPr>
-        <w:spacing w:before="0" w:after="80"/>
+        <w:spacing w:before="0" w:after="120"/>
         <w:jc w:val="center"/>
       </w:pPr>
       <w:r>
         <w:rPr>
           <w:b/>
-          <w:sz w:val="56"/>
+          <w:sz w:val="144"/>
         </w:rPr>
         <w:t>Sugar Ward</w:t>
       </w:r>
@@ -167,31 +167,31 @@
     <w:p>
       <w:pPr>
         <w:spacing w:before="0" w:after="0"/>
-        <w:spacing w:before="1400" w:after="0"/>
+        <w:spacing w:before="400" w:after="0"/>
       </w:pPr>
     </w:p>
     <w:p>
       <w:pPr>
-        <w:spacing w:before="0" w:after="160"/>
+        <w:spacing w:before="0" w:after="240"/>
         <w:jc w:val="center"/>
       </w:pPr>
       <w:r>
         <w:rPr>
           <w:b/>
-          <w:sz w:val="96"/>
+          <w:sz w:val="240"/>
         </w:rPr>
         <w:t>Table 5</w:t>
       </w:r>
     </w:p>
     <w:p>
       <w:pPr>
-        <w:spacing w:before="0" w:after="80"/>
+        <w:spacing w:before="0" w:after="120"/>
         <w:jc w:val="center"/>
       </w:pPr>
       <w:r>
         <w:rPr>
           <w:b/>
-          <w:sz w:val="56"/>
+          <w:sz w:val="144"/>
         </w:rPr>
         <w:t>Madalyn Hunt</w:t>
       </w:r>
@@ -208,31 +208,31 @@
     <w:p>
       <w:pPr>
         <w:spacing w:before="0" w:after="0"/>
-        <w:spacing w:before="1400" w:after="0"/>
+        <w:spacing w:before="400" w:after="0"/>
       </w:pPr>
     </w:p>
     <w:p>
       <w:pPr>
-        <w:spacing w:before="0" w:after="160"/>
+        <w:spacing w:before="0" w:after="240"/>
         <w:jc w:val="center"/>
       </w:pPr>
       <w:r>
         <w:rPr>
           <w:b/>
-          <w:sz w:val="96"/>
+          <w:sz w:val="240"/>
         </w:rPr>
         <w:t>Table 6</w:t>
       </w:r>
     </w:p>
     <w:p>
       <w:pPr>
-        <w:spacing w:before="0" w:after="80"/>
+        <w:spacing w:before="0" w:after="120"/>
         <w:jc w:val="center"/>
       </w:pPr>
       <w:r>
         <w:rPr>
           <w:b/>
-          <w:sz w:val="56"/>
+          <w:sz w:val="120"/>
         </w:rPr>
         <w:t>Moody Creek Ward Families</w:t>
       </w:r>
@@ -248,31 +248,31 @@
     <w:p>
       <w:pPr>
         <w:spacing w:before="0" w:after="0"/>
-        <w:spacing w:before="1400" w:after="0"/>
+        <w:spacing w:before="400" w:after="0"/>
       </w:pPr>
     </w:p>
     <w:p>
       <w:pPr>
-        <w:spacing w:before="0" w:after="160"/>
+        <w:spacing w:before="0" w:after="240"/>
         <w:jc w:val="center"/>
       </w:pPr>
       <w:r>
         <w:rPr>
           <w:b/>
-          <w:sz w:val="96"/>
+          <w:sz w:val="240"/>
         </w:rPr>
         <w:t>Table 7</w:t>
       </w:r>
     </w:p>
     <w:p>
       <w:pPr>
-        <w:spacing w:before="0" w:after="80"/>
+        <w:spacing w:before="0" w:after="120"/>
         <w:jc w:val="center"/>
       </w:pPr>
       <w:r>
         <w:rPr>
           <w:b/>
-          <w:sz w:val="56"/>
+          <w:sz w:val="120"/>
         </w:rPr>
         <w:t>Institute Representatives</w:t>
       </w:r>
@@ -289,31 +289,31 @@
     <w:p>
       <w:pPr>
         <w:spacing w:before="0" w:after="0"/>
-        <w:spacing w:before="1400" w:after="0"/>
+        <w:spacing w:before="400" w:after="0"/>
       </w:pPr>
     </w:p>
     <w:p>
       <w:pPr>
-        <w:spacing w:before="0" w:after="160"/>
+        <w:spacing w:before="0" w:after="240"/>
         <w:jc w:val="center"/>
       </w:pPr>
       <w:r>
         <w:rPr>
           <w:b/>
-          <w:sz w:val="96"/>
+          <w:sz w:val="240"/>
         </w:rPr>
         <w:t>Table 8</w:t>
       </w:r>
     </w:p>
     <w:p>
       <w:pPr>
-        <w:spacing w:before="0" w:after="80"/>
+        <w:spacing w:before="0" w:after="120"/>
         <w:jc w:val="center"/>
       </w:pPr>
       <w:r>
         <w:rPr>
           <w:b/>
-          <w:sz w:val="56"/>
+          <w:sz w:val="120"/>
         </w:rPr>
         <w:t>Johnathan &amp; Keli Huskinson</w:t>
       </w:r>
@@ -329,31 +329,31 @@
     <w:p>
       <w:pPr>
         <w:spacing w:before="0" w:after="0"/>
-        <w:spacing w:before="1400" w:after="0"/>
+        <w:spacing w:before="400" w:after="0"/>
       </w:pPr>
     </w:p>
     <w:p>
       <w:pPr>
-        <w:spacing w:before="0" w:after="160"/>
+        <w:spacing w:before="0" w:after="240"/>
         <w:jc w:val="center"/>
       </w:pPr>
       <w:r>
         <w:rPr>
           <w:b/>
-          <w:sz w:val="96"/>
+          <w:sz w:val="240"/>
         </w:rPr>
         <w:t>Table 9</w:t>
       </w:r>
     </w:p>
     <w:p>
       <w:pPr>
-        <w:spacing w:before="0" w:after="80"/>
+        <w:spacing w:before="0" w:after="120"/>
         <w:jc w:val="center"/>
       </w:pPr>
       <w:r>
         <w:rPr>
           <w:b/>
-          <w:sz w:val="56"/>
+          <w:sz w:val="120"/>
         </w:rPr>
         <w:t>Stake Emergency Committee</w:t>
       </w:r>
@@ -370,31 +370,31 @@
     <w:p>
       <w:pPr>
         <w:spacing w:before="0" w:after="0"/>
-        <w:spacing w:before="1400" w:after="0"/>
+        <w:spacing w:before="400" w:after="0"/>
       </w:pPr>
     </w:p>
     <w:p>
       <w:pPr>
-        <w:spacing w:before="0" w:after="160"/>
+        <w:spacing w:before="0" w:after="240"/>
         <w:jc w:val="center"/>
       </w:pPr>
       <w:r>
         <w:rPr>
           <w:b/>
-          <w:sz w:val="96"/>
+          <w:sz w:val="240"/>
         </w:rPr>
         <w:t>Table 10</w:t>
       </w:r>
     </w:p>
     <w:p>
       <w:pPr>
-        <w:spacing w:before="0" w:after="80"/>
+        <w:spacing w:before="0" w:after="120"/>
         <w:jc w:val="center"/>
       </w:pPr>
       <w:r>
         <w:rPr>
           <w:b/>
-          <w:sz w:val="56"/>
+          <w:sz w:val="120"/>
         </w:rPr>
         <w:t>Stake Emergency Committee</w:t>
       </w:r>
@@ -410,31 +410,31 @@
     <w:p>
       <w:pPr>
         <w:spacing w:before="0" w:after="0"/>
-        <w:spacing w:before="1400" w:after="0"/>
+        <w:spacing w:before="400" w:after="0"/>
       </w:pPr>
     </w:p>
     <w:p>
       <w:pPr>
-        <w:spacing w:before="0" w:after="160"/>
+        <w:spacing w:before="0" w:after="240"/>
+        <w:jc w:val="center"/>
+      </w:pPr>
+      <w:r>
+        <w:rPr>
+          <w:b/>
+          <w:sz w:val="240"/>
+        </w:rPr>
+        <w:t>Table 11</w:t>
+      </w:r>
+    </w:p>
+    <w:p>
+      <w:pPr>
+        <w:spacing w:before="0" w:after="120"/>
         <w:jc w:val="center"/>
       </w:pPr>
       <w:r>
         <w:rPr>
           <w:b/>
           <w:sz w:val="96"/>
-        </w:rPr>
-        <w:t>Table 11</w:t>
-      </w:r>
-    </w:p>
-    <w:p>
-      <w:pPr>
-        <w:spacing w:before="0" w:after="80"/>
-        <w:jc w:val="center"/>
-      </w:pPr>
-      <w:r>
-        <w:rPr>
-          <w:b/>
-          <w:sz w:val="56"/>
         </w:rPr>
         <w:t>North Fork, South Fork, &amp; Teton Rivers</w:t>
       </w:r>
@@ -451,31 +451,31 @@
     <w:p>
       <w:pPr>
         <w:spacing w:before="0" w:after="0"/>
-        <w:spacing w:before="1400" w:after="0"/>
+        <w:spacing w:before="400" w:after="0"/>
       </w:pPr>
     </w:p>
     <w:p>
       <w:pPr>
-        <w:spacing w:before="0" w:after="160"/>
+        <w:spacing w:before="0" w:after="240"/>
         <w:jc w:val="center"/>
       </w:pPr>
       <w:r>
         <w:rPr>
           <w:b/>
-          <w:sz w:val="96"/>
+          <w:sz w:val="240"/>
         </w:rPr>
         <w:t>Table 12</w:t>
       </w:r>
     </w:p>
     <w:p>
       <w:pPr>
-        <w:spacing w:before="0" w:after="80"/>
+        <w:spacing w:before="0" w:after="120"/>
         <w:jc w:val="center"/>
       </w:pPr>
       <w:r>
         <w:rPr>
           <w:b/>
-          <w:sz w:val="56"/>
+          <w:sz w:val="120"/>
         </w:rPr>
         <w:t>Robert &amp; Sandra Myers</w:t>
       </w:r>
@@ -491,31 +491,31 @@
     <w:p>
       <w:pPr>
         <w:spacing w:before="0" w:after="0"/>
-        <w:spacing w:before="1400" w:after="0"/>
+        <w:spacing w:before="400" w:after="0"/>
       </w:pPr>
     </w:p>
     <w:p>
       <w:pPr>
-        <w:spacing w:before="0" w:after="160"/>
+        <w:spacing w:before="0" w:after="240"/>
         <w:jc w:val="center"/>
       </w:pPr>
       <w:r>
         <w:rPr>
           <w:b/>
-          <w:sz w:val="96"/>
+          <w:sz w:val="240"/>
         </w:rPr>
         <w:t>Table 13</w:t>
       </w:r>
     </w:p>
     <w:p>
       <w:pPr>
-        <w:spacing w:before="0" w:after="80"/>
+        <w:spacing w:before="0" w:after="120"/>
         <w:jc w:val="center"/>
       </w:pPr>
       <w:r>
         <w:rPr>
           <w:b/>
-          <w:sz w:val="56"/>
+          <w:sz w:val="144"/>
         </w:rPr>
         <w:t>Canyon Creek Youth</w:t>
       </w:r>
@@ -532,31 +532,31 @@
     <w:p>
       <w:pPr>
         <w:spacing w:before="0" w:after="0"/>
-        <w:spacing w:before="1400" w:after="0"/>
+        <w:spacing w:before="400" w:after="0"/>
       </w:pPr>
     </w:p>
     <w:p>
       <w:pPr>
-        <w:spacing w:before="0" w:after="160"/>
+        <w:spacing w:before="0" w:after="240"/>
         <w:jc w:val="center"/>
       </w:pPr>
       <w:r>
         <w:rPr>
           <w:b/>
-          <w:sz w:val="96"/>
+          <w:sz w:val="240"/>
         </w:rPr>
         <w:t>Table 14</w:t>
       </w:r>
     </w:p>
     <w:p>
       <w:pPr>
-        <w:spacing w:before="0" w:after="80"/>
+        <w:spacing w:before="0" w:after="120"/>
         <w:jc w:val="center"/>
       </w:pPr>
       <w:r>
         <w:rPr>
           <w:b/>
-          <w:sz w:val="56"/>
+          <w:sz w:val="144"/>
         </w:rPr>
         <w:t>Ponderosa Ward</w:t>
       </w:r>
@@ -572,12 +572,25 @@
     <w:p>
       <w:pPr>
         <w:spacing w:before="0" w:after="0"/>
-        <w:spacing w:before="1400" w:after="0"/>
+        <w:spacing w:before="400" w:after="0"/>
       </w:pPr>
     </w:p>
     <w:p>
       <w:pPr>
-        <w:spacing w:before="0" w:after="160"/>
+        <w:spacing w:before="0" w:after="240"/>
+        <w:jc w:val="center"/>
+      </w:pPr>
+      <w:r>
+        <w:rPr>
+          <w:b/>
+          <w:sz w:val="240"/>
+        </w:rPr>
+        <w:t>Table 15</w:t>
+      </w:r>
+    </w:p>
+    <w:p>
+      <w:pPr>
+        <w:spacing w:before="0" w:after="120"/>
         <w:jc w:val="center"/>
       </w:pPr>
       <w:r>
@@ -585,44 +598,31 @@
           <w:b/>
           <w:sz w:val="96"/>
         </w:rPr>
-        <w:t>Table 15</w:t>
+        <w:t>Garth &amp; Ruth Miller</w:t>
       </w:r>
     </w:p>
     <w:p>
       <w:pPr>
-        <w:spacing w:before="0" w:after="80"/>
+        <w:spacing w:before="0" w:after="120"/>
         <w:jc w:val="center"/>
       </w:pPr>
       <w:r>
         <w:rPr>
           <w:b/>
-          <w:sz w:val="56"/>
-        </w:rPr>
-        <w:t>Garth &amp; Ruth Miller</w:t>
-      </w:r>
-    </w:p>
-    <w:p>
-      <w:pPr>
-        <w:spacing w:before="0" w:after="80"/>
-        <w:jc w:val="center"/>
-      </w:pPr>
-      <w:r>
-        <w:rPr>
-          <w:b/>
-          <w:sz w:val="56"/>
+          <w:sz w:val="96"/>
         </w:rPr>
         <w:t>Joseph &amp; Debra Cherrington</w:t>
       </w:r>
     </w:p>
     <w:p>
       <w:pPr>
-        <w:spacing w:before="0" w:after="80"/>
+        <w:spacing w:before="0" w:after="120"/>
         <w:jc w:val="center"/>
       </w:pPr>
       <w:r>
         <w:rPr>
           <w:b/>
-          <w:sz w:val="56"/>
+          <w:sz w:val="96"/>
         </w:rPr>
         <w:t>Bryce &amp; Sherry Holman</w:t>
       </w:r>
@@ -639,31 +639,31 @@
     <w:p>
       <w:pPr>
         <w:spacing w:before="0" w:after="0"/>
-        <w:spacing w:before="1400" w:after="0"/>
+        <w:spacing w:before="400" w:after="0"/>
       </w:pPr>
     </w:p>
     <w:p>
       <w:pPr>
-        <w:spacing w:before="0" w:after="160"/>
+        <w:spacing w:before="0" w:after="240"/>
+        <w:jc w:val="center"/>
+      </w:pPr>
+      <w:r>
+        <w:rPr>
+          <w:b/>
+          <w:sz w:val="240"/>
+        </w:rPr>
+        <w:t>Table 16</w:t>
+      </w:r>
+    </w:p>
+    <w:p>
+      <w:pPr>
+        <w:spacing w:before="0" w:after="120"/>
         <w:jc w:val="center"/>
       </w:pPr>
       <w:r>
         <w:rPr>
           <w:b/>
           <w:sz w:val="96"/>
-        </w:rPr>
-        <w:t>Table 16</w:t>
-      </w:r>
-    </w:p>
-    <w:p>
-      <w:pPr>
-        <w:spacing w:before="0" w:after="80"/>
-        <w:jc w:val="center"/>
-      </w:pPr>
-      <w:r>
-        <w:rPr>
-          <w:b/>
-          <w:sz w:val="56"/>
         </w:rPr>
         <w:t>Heritage Park, Grand Teton, &amp; Canyon Creek</w:t>
       </w:r>
@@ -679,31 +679,31 @@
     <w:p>
       <w:pPr>
         <w:spacing w:before="0" w:after="0"/>
-        <w:spacing w:before="1400" w:after="0"/>
+        <w:spacing w:before="400" w:after="0"/>
       </w:pPr>
     </w:p>
     <w:p>
       <w:pPr>
-        <w:spacing w:before="0" w:after="160"/>
+        <w:spacing w:before="0" w:after="240"/>
         <w:jc w:val="center"/>
       </w:pPr>
       <w:r>
         <w:rPr>
           <w:b/>
-          <w:sz w:val="96"/>
+          <w:sz w:val="240"/>
         </w:rPr>
         <w:t>Table 17</w:t>
       </w:r>
     </w:p>
     <w:p>
       <w:pPr>
-        <w:spacing w:before="0" w:after="80"/>
+        <w:spacing w:before="0" w:after="120"/>
         <w:jc w:val="center"/>
       </w:pPr>
       <w:r>
         <w:rPr>
           <w:b/>
-          <w:sz w:val="56"/>
+          <w:sz w:val="144"/>
         </w:rPr>
         <w:t>Rozan &amp; Jerry Miller</w:t>
       </w:r>
@@ -720,31 +720,31 @@
     <w:p>
       <w:pPr>
         <w:spacing w:before="0" w:after="0"/>
-        <w:spacing w:before="1400" w:after="0"/>
+        <w:spacing w:before="400" w:after="0"/>
       </w:pPr>
     </w:p>
     <w:p>
       <w:pPr>
-        <w:spacing w:before="0" w:after="160"/>
+        <w:spacing w:before="0" w:after="240"/>
         <w:jc w:val="center"/>
       </w:pPr>
       <w:r>
         <w:rPr>
           <w:b/>
-          <w:sz w:val="96"/>
+          <w:sz w:val="240"/>
         </w:rPr>
         <w:t>Table 18</w:t>
       </w:r>
     </w:p>
     <w:p>
       <w:pPr>
-        <w:spacing w:before="0" w:after="80"/>
+        <w:spacing w:before="0" w:after="120"/>
         <w:jc w:val="center"/>
       </w:pPr>
       <w:r>
         <w:rPr>
           <w:b/>
-          <w:sz w:val="56"/>
+          <w:sz w:val="120"/>
         </w:rPr>
         <w:t>North Fork Ward Families</w:t>
       </w:r>
@@ -760,31 +760,31 @@
     <w:p>
       <w:pPr>
         <w:spacing w:before="0" w:after="0"/>
-        <w:spacing w:before="1400" w:after="0"/>
+        <w:spacing w:before="400" w:after="0"/>
       </w:pPr>
     </w:p>
     <w:p>
       <w:pPr>
-        <w:spacing w:before="0" w:after="160"/>
+        <w:spacing w:before="0" w:after="240"/>
         <w:jc w:val="center"/>
       </w:pPr>
       <w:r>
         <w:rPr>
           <w:b/>
-          <w:sz w:val="96"/>
+          <w:sz w:val="240"/>
         </w:rPr>
         <w:t>Table 19</w:t>
       </w:r>
     </w:p>
     <w:p>
       <w:pPr>
-        <w:spacing w:before="0" w:after="80"/>
+        <w:spacing w:before="0" w:after="120"/>
         <w:jc w:val="center"/>
       </w:pPr>
       <w:r>
         <w:rPr>
           <w:b/>
-          <w:sz w:val="56"/>
+          <w:sz w:val="120"/>
         </w:rPr>
         <w:t>Teton Island &amp; Newdale</w:t>
       </w:r>

</xml_diff>